<commit_message>
Resume updates and prompt injection safeguards
</commit_message>
<xml_diff>
--- a/frontend/public/Duane_Pinkerton.docx
+++ b/frontend/public/Duane_Pinkerton.docx
@@ -135,7 +135,7 @@
         <w:spacing w:after="60"/>
       </w:pPr>
       <w:r>
-        <w:t>Twenty-six years in technical professional services, consistently at the intersection of deep implementation work and direct customer engagement. My career has been built around a specific loop: sit with a customer, understand what they actually need, figure out where the product falls short, and go write the missing piece. I’ve built data pipelines and integration systems from scratch, owned them end-to-end through production at enterprise scale, and made the architectural decisions about how they grow. I’m drawn to understanding how systems work, and to making them work better.</w:t>
+        <w:t>20+ years in technical professional services, consistently at the intersection of deep implementation work and direct customer engagement. My career has been built around a specific loop: sit with a customer, understand what they actually need, figure out where the product falls short, and go write the missing piece. I’ve built data pipelines and integration systems from scratch, owned them end-to-end through production at enterprise scale, and made the architectural decisions about how they grow. I’m drawn to understanding how systems work, and to making them work better.</w:t>
       </w:r>
     </w:p>
     <w:p>
@@ -188,7 +188,7 @@
         <w:rPr>
           <w:color w:val="444444"/>
         </w:rPr>
-        <w:t>Java · Python · SQL · Unix/Shell · REST APIs</w:t>
+        <w:t>Python · Java · SQL · JavaScript · Unix/Shell · REST APIs</w:t>
       </w:r>
     </w:p>
     <w:p>
@@ -206,7 +206,7 @@
         <w:rPr>
           <w:color w:val="444444"/>
         </w:rPr>
-        <w:t>Docker · Kubernetes · OCI · Git · Jenkins</w:t>
+        <w:t>Docker · Kubernetes · AWS (EC2) · Oracle Cloud Infrastructure (OCI) · Linode · Git · Jenkins · CI/CD</w:t>
       </w:r>
     </w:p>
     <w:p>
@@ -227,25 +227,79 @@
         <w:rPr>
           <w:color w:val="444444"/>
         </w:rPr>
-        <w:t>SQL performance tuning · Data pipeline architecture · Distributed systems operations</w:t>
-      </w:r>
-    </w:p>
-    <w:p>
-      <w:pPr>
-        <w:spacing w:before="40" w:after="40"/>
-      </w:pPr>
-      <w:r>
-        <w:rPr>
-          <w:b/>
-          <w:bCs/>
-        </w:rPr>
-        <w:t>AI &amp; Emerging:</w:t>
-      </w:r>
-      <w:r>
-        <w:rPr>
-          <w:color w:val="444444"/>
-        </w:rPr>
-        <w:t xml:space="preserve"> Claude API / Anthropic SDK · Multi-provider LLM integration · RAG patterns and knowledge-backed chat · Vector embeddings and pgvector · Prompt engineering and system prompt design · Agentic workflows and MCP · n8n workflow orchestration</w:t>
+        <w:t>SQL performance tuning · Data pipeline architecture · Distributed systems operations · System integration</w:t>
+      </w:r>
+    </w:p>
+    <w:p>
+      <w:pPr>
+        <w:spacing w:before="40" w:after="40"/>
+      </w:pPr>
+      <w:r>
+        <w:rPr>
+          <w:b/>
+          <w:bCs/>
+        </w:rPr>
+        <w:t xml:space="preserve">LLM integration:  </w:t>
+      </w:r>
+      <w:r>
+        <w:rPr>
+          <w:color w:val="444444"/>
+        </w:rPr>
+        <w:t>Claude (Anthropic), OpenAI, multi-provider routing; RAG patterns, vector search, pgvector, semantic embeddings, Supabase</w:t>
+      </w:r>
+    </w:p>
+    <w:p>
+      <w:pPr>
+        <w:spacing w:before="40" w:after="40"/>
+      </w:pPr>
+      <w:r>
+        <w:rPr>
+          <w:b/>
+          <w:bCs/>
+        </w:rPr>
+        <w:t xml:space="preserve">Agentic systems:  </w:t>
+      </w:r>
+      <w:r>
+        <w:rPr>
+          <w:color w:val="444444"/>
+        </w:rPr>
+        <w:t>LangGraph (orchestration, checkpointing, human-in-the-loop), MCP (Model Context Protocol, consuming + publishing servers)</w:t>
+      </w:r>
+    </w:p>
+    <w:p>
+      <w:pPr>
+        <w:spacing w:before="40" w:after="40"/>
+      </w:pPr>
+      <w:r>
+        <w:rPr>
+          <w:b/>
+          <w:bCs/>
+        </w:rPr>
+        <w:t xml:space="preserve">Prompt engineering:  </w:t>
+      </w:r>
+      <w:r>
+        <w:rPr>
+          <w:color w:val="444444"/>
+        </w:rPr>
+        <w:t>System prompt design, context engineering, Classifier+Critic validation loops, evaluation</w:t>
+      </w:r>
+    </w:p>
+    <w:p>
+      <w:pPr>
+        <w:spacing w:before="40" w:after="40"/>
+      </w:pPr>
+      <w:r>
+        <w:rPr>
+          <w:b/>
+          <w:bCs/>
+        </w:rPr>
+        <w:t xml:space="preserve">Tooling &amp; production:  </w:t>
+      </w:r>
+      <w:r>
+        <w:rPr>
+          <w:color w:val="444444"/>
+        </w:rPr>
+        <w:t>Langfuse (observability, traces, prompt versioning), n8n (workflow automation), deployment, security threat modeling</w:t>
       </w:r>
     </w:p>
     <w:p>
@@ -262,7 +316,7 @@
           <w:sz w:val="22"/>
           <w:szCs w:val="22"/>
         </w:rPr>
-        <w:t>Current Projects &amp; Learning</w:t>
+        <w:t>Current Projects (2024–present)</w:t>
       </w:r>
     </w:p>
     <w:p>
@@ -270,7 +324,7 @@
         <w:spacing w:after="80"/>
       </w:pPr>
       <w:r>
-        <w:t>Actively building hands-on experience in AI and modern infrastructure:</w:t>
+        <w:t>Actively building and deploying production AI systems:</w:t>
       </w:r>
     </w:p>
     <w:p>
@@ -283,7 +337,14 @@
         <w:spacing w:before="40" w:after="40"/>
       </w:pPr>
       <w:r>
-        <w:t>Two production sites running AI as a core runtime feature: hire-duane.org, an interactive resume with RAG-backed chat and job-fit evaluation optimized for agentic crawling, and job-radar.net, a multi-provider job search tool with AI scoring, application workflow support, and interview prep — with more in development</w:t>
+        <w:rPr>
+          <w:b/>
+          <w:bCs/>
+        </w:rPr>
+        <w:t xml:space="preserve">Production AI applications: </w:t>
+      </w:r>
+      <w:r>
+        <w:t>Two live sites running AI as a core runtime feature: hire-duane.org (interactive resume with RAG-backed chat, job-fit evaluation, and agentic crawling support) and job-radar.net (multi-provider job search with AI scoring, application workflow, and interview prep; hosted on AWS)</w:t>
       </w:r>
     </w:p>
     <w:p>
@@ -296,7 +357,14 @@
         <w:spacing w:before="40" w:after="40"/>
       </w:pPr>
       <w:r>
-        <w:t>Deployed OpenBrain and MCP servers: persistent, model-agnostic memory infrastructure using PostgreSQL with pgvector, enabling semantic retrieval across Claude, ChatGPT, Cursor, and any MCP-compatible client from a single shared knowledge base</w:t>
+        <w:rPr>
+          <w:b/>
+          <w:bCs/>
+        </w:rPr>
+        <w:t xml:space="preserve">Persistent AI memory infrastructure: </w:t>
+      </w:r>
+      <w:r>
+        <w:t>Deployed OpenBrain and MCP servers: model-agnostic memory layer using PostgreSQL + pgvector (via Supabase), enabling semantic retrieval across Claude, ChatGPT, Cursor, and any MCP-compatible client from a single shared knowledge base</w:t>
       </w:r>
     </w:p>
     <w:p>
@@ -309,7 +377,14 @@
         <w:spacing w:before="40" w:after="40"/>
       </w:pPr>
       <w:r>
-        <w:t>Building workflow orchestration pipelines in n8n, connecting APIs and services with LLM-powered decision nodes in ways that weren’t practical before AI</w:t>
+        <w:rPr>
+          <w:b/>
+          <w:bCs/>
+        </w:rPr>
+        <w:t xml:space="preserve">Workflow automation: </w:t>
+      </w:r>
+      <w:r>
+        <w:t>Building orchestration pipelines in n8n, connecting APIs and services with LLM-powered decision nodes for complex multi-step automation</w:t>
       </w:r>
     </w:p>
     <w:p>
@@ -322,7 +397,14 @@
         <w:spacing w:before="40" w:after="40"/>
       </w:pPr>
       <w:r>
-        <w:t>Using LLMs to diagnose system and configuration issues in Home Assistant, treating AI as a knowledgeable first-responder for troubleshooting rather than a search engine</w:t>
+        <w:rPr>
+          <w:b/>
+          <w:bCs/>
+        </w:rPr>
+        <w:t xml:space="preserve">Agentic email pipeline </w:t>
+      </w:r>
+      <w:r>
+        <w:t>(in design/early build): LangGraph-orchestrated agent that classifies job emails, extracts structured data through a Classifier+Critic validation loop, and escalates ambiguous cases to a human via interactive Slack, with Langfuse observability and MCP servers on both ends</w:t>
       </w:r>
     </w:p>
     <w:p>
@@ -335,74 +417,7 @@
         <w:spacing w:before="40" w:after="40"/>
       </w:pPr>
       <w:r>
-        <w:t>Building AI agents and agentic workflows for Home Assistant using prompt engineering, providing natural-language control of automations, device states, and scenes through conversational AI</w:t>
-      </w:r>
-    </w:p>
-    <w:p>
-      <w:pPr>
-        <w:pBdr>
-          <w:bottom w:val="single" w:sz="6" w:space="4" w:color="2B5BA8"/>
-        </w:pBdr>
-        <w:spacing w:before="260" w:after="120"/>
-      </w:pPr>
-      <w:r>
-        <w:rPr>
-          <w:b/>
-          <w:bCs/>
-          <w:sz w:val="22"/>
-          <w:szCs w:val="22"/>
-        </w:rPr>
-        <w:t>Experience</w:t>
-      </w:r>
-    </w:p>
-    <w:p>
-      <w:pPr>
-        <w:tabs>
-          <w:tab w:val="right" w:pos="10080"/>
-        </w:tabs>
-        <w:spacing w:before="220" w:after="40"/>
-      </w:pPr>
-      <w:r>
-        <w:rPr>
-          <w:b/>
-          <w:bCs/>
-          <w:sz w:val="22"/>
-          <w:szCs w:val="22"/>
-        </w:rPr>
-        <w:t>Responsys / Oracle</w:t>
-      </w:r>
-      <w:r>
-        <w:rPr>
-          <w:color w:val="666666"/>
-        </w:rPr>
-        <w:tab/>
-        <w:t>2007 – 2026</w:t>
-      </w:r>
-    </w:p>
-    <w:p>
-      <w:pPr>
-        <w:spacing w:after="80"/>
-      </w:pPr>
-      <w:r>
-        <w:rPr>
-          <w:i/>
-          <w:iCs/>
-          <w:color w:val="555555"/>
-        </w:rPr>
-        <w:t>Principal Professional Solutions Consultant → Data Architect → Solutions Architect → Principal Applications Engineer, Operations</w:t>
-      </w:r>
-    </w:p>
-    <w:p>
-      <w:pPr>
-        <w:spacing w:before="120" w:after="60"/>
-      </w:pPr>
-      <w:r>
-        <w:rPr>
-          <w:b/>
-          <w:bCs/>
-          <w:color w:val="444444"/>
-        </w:rPr>
-        <w:t>Building the Platform  (2007 – 2013)</w:t>
+        <w:t>Includes a formal security threat model covering prompt injection, stored XSS, and credential handling; mitigations baked into each build phase, not bolted on after</w:t>
       </w:r>
     </w:p>
     <w:p>
@@ -415,7 +430,14 @@
         <w:spacing w:before="40" w:after="40"/>
       </w:pPr>
       <w:r>
-        <w:t>Designed and built the company’s custom data pipeline and integration framework from scratch; it replaced 95% of existing custom scripts in production and became the standard across the professional services organization, eventually supporting 200+ production jobs across 80+ enterprise customers</w:t>
+        <w:rPr>
+          <w:b/>
+          <w:bCs/>
+        </w:rPr>
+        <w:t xml:space="preserve">LLM-driven troubleshooting: </w:t>
+      </w:r>
+      <w:r>
+        <w:t>Using LLMs as a first-responder diagnostic layer for system and configuration issues in Home Assistant, bypassing traditional search-based debugging</w:t>
       </w:r>
     </w:p>
     <w:p>
@@ -428,7 +450,110 @@
         <w:spacing w:before="40" w:after="40"/>
       </w:pPr>
       <w:r>
-        <w:t>Owned end-to-end delivery of customer engagements: discovery, requirements, documentation, implementation, custom development, and handover to support</w:t>
+        <w:rPr>
+          <w:b/>
+          <w:bCs/>
+        </w:rPr>
+        <w:t xml:space="preserve">AI agents for home automation: </w:t>
+      </w:r>
+      <w:r>
+        <w:t>Prompt-engineered agents providing natural-language control of Home Assistant automations, device states, and scenes through conversational AI</w:t>
+      </w:r>
+    </w:p>
+    <w:p>
+      <w:pPr>
+        <w:pBdr>
+          <w:bottom w:val="single" w:sz="6" w:space="4" w:color="2B5BA8"/>
+        </w:pBdr>
+        <w:spacing w:before="260" w:after="120"/>
+        <w:rPr>
+          <w:b/>
+          <w:bCs/>
+          <w:sz w:val="22"/>
+          <w:szCs w:val="22"/>
+        </w:rPr>
+      </w:pPr>
+    </w:p>
+    <w:p>
+      <w:pPr>
+        <w:pBdr>
+          <w:bottom w:val="single" w:sz="6" w:space="4" w:color="2B5BA8"/>
+        </w:pBdr>
+        <w:spacing w:before="260" w:after="120"/>
+        <w:rPr>
+          <w:b/>
+          <w:bCs/>
+          <w:sz w:val="22"/>
+          <w:szCs w:val="22"/>
+        </w:rPr>
+      </w:pPr>
+    </w:p>
+    <w:p>
+      <w:pPr>
+        <w:pBdr>
+          <w:bottom w:val="single" w:sz="6" w:space="4" w:color="2B5BA8"/>
+        </w:pBdr>
+        <w:spacing w:before="260" w:after="120"/>
+      </w:pPr>
+      <w:r>
+        <w:rPr>
+          <w:b/>
+          <w:bCs/>
+          <w:sz w:val="22"/>
+          <w:szCs w:val="22"/>
+        </w:rPr>
+        <w:lastRenderedPageBreak/>
+        <w:t>Experience</w:t>
+      </w:r>
+    </w:p>
+    <w:p>
+      <w:pPr>
+        <w:tabs>
+          <w:tab w:val="right" w:pos="10080"/>
+        </w:tabs>
+        <w:spacing w:before="220" w:after="40"/>
+      </w:pPr>
+      <w:r>
+        <w:rPr>
+          <w:b/>
+          <w:bCs/>
+          <w:sz w:val="22"/>
+          <w:szCs w:val="22"/>
+        </w:rPr>
+        <w:t>Responsys / Oracle</w:t>
+      </w:r>
+      <w:r>
+        <w:rPr>
+          <w:color w:val="666666"/>
+        </w:rPr>
+        <w:tab/>
+        <w:t>2007 – 2026</w:t>
+      </w:r>
+    </w:p>
+    <w:p>
+      <w:pPr>
+        <w:spacing w:after="80"/>
+      </w:pPr>
+      <w:r>
+        <w:rPr>
+          <w:i/>
+          <w:iCs/>
+          <w:color w:val="555555"/>
+        </w:rPr>
+        <w:t>Principal Professional Solutions Consultant → Data Architect → Solutions Architect → Principal Applications Engineer, Operations</w:t>
+      </w:r>
+    </w:p>
+    <w:p>
+      <w:pPr>
+        <w:spacing w:before="120" w:after="60"/>
+      </w:pPr>
+      <w:r>
+        <w:rPr>
+          <w:b/>
+          <w:bCs/>
+          <w:color w:val="444444"/>
+        </w:rPr>
+        <w:t>Building the Platform  (2007 – 2013)</w:t>
       </w:r>
     </w:p>
     <w:p>
@@ -441,20 +566,7 @@
         <w:spacing w:before="40" w:after="40"/>
       </w:pPr>
       <w:r>
-        <w:t>Trained consultants and partners on implementation best practices; served as the primary subject matter expert for custom data integration across the organization</w:t>
-      </w:r>
-    </w:p>
-    <w:p>
-      <w:pPr>
-        <w:spacing w:before="120" w:after="60"/>
-      </w:pPr>
-      <w:r>
-        <w:rPr>
-          <w:b/>
-          <w:bCs/>
-          <w:color w:val="444444"/>
-        </w:rPr>
-        <w:t>Owning the Platform  (2013 – 2026)</w:t>
+        <w:t>Designed and built the company’s custom data pipeline and integration framework from scratch: replaced 95% of existing custom scripts in production, became the organization standard, and scaled to 200+ production jobs across 80+ enterprise customers</w:t>
       </w:r>
     </w:p>
     <w:p>
@@ -467,8 +579,7 @@
         <w:spacing w:before="40" w:after="40"/>
       </w:pPr>
       <w:r>
-        <w:lastRenderedPageBreak/>
-        <w:t>Following Oracle’s acquisition and consolidation of the professional services organization, transitioned into an operations role to preserve and evolve the platform, making key architectural decisions around reliability, redundancy, and capacity planning</w:t>
+        <w:t>Owned end-to-end delivery of customer engagements: discovery, requirements gathering, documentation, implementation, custom development, and handover to support</w:t>
       </w:r>
     </w:p>
     <w:p>
@@ -481,7 +592,20 @@
         <w:spacing w:before="40" w:after="40"/>
       </w:pPr>
       <w:r>
-        <w:t>Led the migration of the entire environment from bare metal to a containerized infrastructure on OCI using Docker, Kubernetes, Git, and Jenkins, completed with zero significant downtime events</w:t>
+        <w:t>Trained consultants and partners on implementation best practices; primary subject matter expert for custom data integration across the organization</w:t>
+      </w:r>
+    </w:p>
+    <w:p>
+      <w:pPr>
+        <w:spacing w:before="120" w:after="60"/>
+      </w:pPr>
+      <w:r>
+        <w:rPr>
+          <w:b/>
+          <w:bCs/>
+          <w:color w:val="444444"/>
+        </w:rPr>
+        <w:t>Owning the Platform  (2013 – 2026)</w:t>
       </w:r>
     </w:p>
     <w:p>
@@ -494,67 +618,7 @@
         <w:spacing w:before="40" w:after="40"/>
       </w:pPr>
       <w:r>
-        <w:t>Responsible for deploying the environment in new datacenters as the platform expanded</w:t>
-      </w:r>
-    </w:p>
-    <w:p>
-      <w:pPr>
-        <w:spacing w:before="80" w:after="40"/>
-      </w:pPr>
-      <w:r>
-        <w:rPr>
-          <w:b/>
-          <w:bCs/>
-          <w:color w:val="666666"/>
-          <w:sz w:val="17"/>
-          <w:szCs w:val="17"/>
-        </w:rPr>
-        <w:t xml:space="preserve">Notable customers: </w:t>
-      </w:r>
-      <w:r>
-        <w:rPr>
-          <w:color w:val="666666"/>
-          <w:sz w:val="17"/>
-          <w:szCs w:val="17"/>
-        </w:rPr>
-        <w:t>Williams Sonoma, Pottery Barn, West Elm, Epson, Orbitz, Carlson Wagonlit, Verizon, Disney, Symantec, Lenovo, Levi’s, Lego, PayPal, See’s, Coach, Grainger, Intuit, Wells Fargo, BabyCenter</w:t>
-      </w:r>
-    </w:p>
-    <w:p>
-      <w:pPr>
-        <w:tabs>
-          <w:tab w:val="right" w:pos="10080"/>
-        </w:tabs>
-        <w:spacing w:before="220" w:after="40"/>
-      </w:pPr>
-      <w:r>
-        <w:rPr>
-          <w:b/>
-          <w:bCs/>
-          <w:sz w:val="22"/>
-          <w:szCs w:val="22"/>
-        </w:rPr>
-        <w:t>Extensity / Geac / Infor</w:t>
-      </w:r>
-      <w:r>
-        <w:rPr>
-          <w:color w:val="666666"/>
-        </w:rPr>
-        <w:tab/>
-        <w:t>1999 – 2007</w:t>
-      </w:r>
-    </w:p>
-    <w:p>
-      <w:pPr>
-        <w:spacing w:after="80"/>
-      </w:pPr>
-      <w:r>
-        <w:rPr>
-          <w:i/>
-          <w:iCs/>
-          <w:color w:val="555555"/>
-        </w:rPr>
-        <w:t>Principal Professional Services Consultant → Team Lead, Custom Solutions Group</w:t>
+        <w:t>Made key architectural decisions around platform reliability, redundancy, and capacity planning following Oracle’s acquisition</w:t>
       </w:r>
     </w:p>
     <w:p>
@@ -567,7 +631,7 @@
         <w:spacing w:before="40" w:after="40"/>
       </w:pPr>
       <w:r>
-        <w:t>Owned end-to-end delivery of enterprise software implementations, from discovery through training and support handover, for a portfolio of complex domestic and international clients</w:t>
+        <w:t>Led the migration of the full environment from bare metal to a containerized infrastructure on Oracle Cloud Infrastructure (OCI) using Docker, Kubernetes, Git, and Jenkins; completed with zero significant downtime events</w:t>
       </w:r>
     </w:p>
     <w:p>
@@ -580,7 +644,67 @@
         <w:spacing w:before="40" w:after="40"/>
       </w:pPr>
       <w:r>
-        <w:t>Built multi-currency and exchange rate support from scratch, enabling the company’s first international enterprise deployments, including rollouts for Cisco and Sybase across their global offices; those capabilities were later incorporated into the product itself</w:t>
+        <w:t>Deployed and stood up the environment in new datacenters as the platform expanded geographically</w:t>
+      </w:r>
+    </w:p>
+    <w:p>
+      <w:pPr>
+        <w:spacing w:before="80" w:after="40"/>
+      </w:pPr>
+      <w:r>
+        <w:rPr>
+          <w:b/>
+          <w:bCs/>
+          <w:color w:val="666666"/>
+          <w:sz w:val="17"/>
+          <w:szCs w:val="17"/>
+        </w:rPr>
+        <w:t xml:space="preserve">Notable customers: </w:t>
+      </w:r>
+      <w:r>
+        <w:rPr>
+          <w:color w:val="666666"/>
+          <w:sz w:val="17"/>
+          <w:szCs w:val="17"/>
+        </w:rPr>
+        <w:t>Williams Sonoma, Pottery Barn, West Elm, Epson, Orbitz, Carlson Wagonlit, Verizon, Disney, Symantec, Lenovo, Levi’s, Lego, PayPal, See’s, Coach, Grainger, Intuit, Wells Fargo, BabyCenter</w:t>
+      </w:r>
+    </w:p>
+    <w:p>
+      <w:pPr>
+        <w:tabs>
+          <w:tab w:val="right" w:pos="10080"/>
+        </w:tabs>
+        <w:spacing w:before="220" w:after="40"/>
+      </w:pPr>
+      <w:r>
+        <w:rPr>
+          <w:b/>
+          <w:bCs/>
+          <w:sz w:val="22"/>
+          <w:szCs w:val="22"/>
+        </w:rPr>
+        <w:t>Extensity / Geac / Infor</w:t>
+      </w:r>
+      <w:r>
+        <w:rPr>
+          <w:color w:val="666666"/>
+        </w:rPr>
+        <w:tab/>
+        <w:t>1999 – 2007</w:t>
+      </w:r>
+    </w:p>
+    <w:p>
+      <w:pPr>
+        <w:spacing w:after="80"/>
+      </w:pPr>
+      <w:r>
+        <w:rPr>
+          <w:i/>
+          <w:iCs/>
+          <w:color w:val="555555"/>
+        </w:rPr>
+        <w:t>Principal Professional Services Consultant → Team Lead, Custom Solutions Group</w:t>
       </w:r>
     </w:p>
     <w:p>
@@ -593,7 +717,7 @@
         <w:spacing w:before="40" w:after="40"/>
       </w:pPr>
       <w:r>
-        <w:t>Worked directly with engineering to get bug fixes and code changes into the codebase</w:t>
+        <w:t>Owned end-to-end delivery of enterprise software implementations (discovery, requirements, implementation, training, and support handover) across a portfolio of complex domestic and international clients</w:t>
       </w:r>
     </w:p>
     <w:p>
@@ -606,7 +730,33 @@
         <w:spacing w:before="40" w:after="40"/>
       </w:pPr>
       <w:r>
-        <w:t>Spent 18 months in the UK as the lead technical member of the founding professional services team, training and mentoring three colleagues and was hands-on across all client implementations</w:t>
+        <w:t>Built multi-currency and exchange rate support from scratch, enabling the company’s first international enterprise deployments (Cisco, Sybase); those capabilities were later incorporated into the core product</w:t>
+      </w:r>
+    </w:p>
+    <w:p>
+      <w:pPr>
+        <w:pStyle w:val="ListParagraph"/>
+        <w:numPr>
+          <w:ilvl w:val="0"/>
+          <w:numId w:val="2"/>
+        </w:numPr>
+        <w:spacing w:before="40" w:after="40"/>
+      </w:pPr>
+      <w:r>
+        <w:t>Worked directly with engineering to drive bug fixes and code changes into the product codebase</w:t>
+      </w:r>
+    </w:p>
+    <w:p>
+      <w:pPr>
+        <w:pStyle w:val="ListParagraph"/>
+        <w:numPr>
+          <w:ilvl w:val="0"/>
+          <w:numId w:val="2"/>
+        </w:numPr>
+        <w:spacing w:before="40" w:after="40"/>
+      </w:pPr>
+      <w:r>
+        <w:t>Spent 18 months in the UK as lead technical member of the founding professional services team; trained and mentored three colleagues, hands-on across all client implementations</w:t>
       </w:r>
     </w:p>
     <w:p>

</xml_diff>

<commit_message>
Updating resume to reflect completed project milestones
</commit_message>
<xml_diff>
--- a/frontend/public/Duane_Pinkerton.docx
+++ b/frontend/public/Duane_Pinkerton.docx
@@ -341,10 +341,10 @@
           <w:b/>
           <w:bCs/>
         </w:rPr>
-        <w:t xml:space="preserve">Production AI applications: </w:t>
-      </w:r>
-      <w:r>
-        <w:t>Two live sites running AI as a core runtime feature: hire-duane.org (interactive resume with RAG-backed chat, job-fit evaluation, and agentic crawling support) and job-radar.net (multi-provider job search with AI scoring, application workflow, and interview prep; hosted on AWS)</w:t>
+        <w:t xml:space="preserve">Agentic email pipeline: </w:t>
+      </w:r>
+      <w:r>
+        <w:t>LangGraph-orchestrated agent that classifies job emails, extracts structured data through a Classifier+Critic validation loop, and escalates ambiguous cases to a human via interactive Slack, with Langfuse observability and MCP servers on both ends</w:t>
       </w:r>
     </w:p>
     <w:p>
@@ -357,14 +357,7 @@
         <w:spacing w:before="40" w:after="40"/>
       </w:pPr>
       <w:r>
-        <w:rPr>
-          <w:b/>
-          <w:bCs/>
-        </w:rPr>
-        <w:t xml:space="preserve">Persistent AI memory infrastructure: </w:t>
-      </w:r>
-      <w:r>
-        <w:t>Deployed OpenBrain and MCP servers: model-agnostic memory layer using PostgreSQL + pgvector (via Supabase), enabling semantic retrieval across Claude, ChatGPT, Cursor, and any MCP-compatible client from a single shared knowledge base</w:t>
+        <w:t>Includes a formal security threat model covering prompt injection, stored XSS, and credential handling; mitigations baked into each build phase, not bolted on after</w:t>
       </w:r>
     </w:p>
     <w:p>
@@ -381,10 +374,10 @@
           <w:b/>
           <w:bCs/>
         </w:rPr>
-        <w:t xml:space="preserve">Workflow automation: </w:t>
-      </w:r>
-      <w:r>
-        <w:t>Building orchestration pipelines in n8n, connecting APIs and services with LLM-powered decision nodes for complex multi-step automation</w:t>
+        <w:t xml:space="preserve">Production AI applications: </w:t>
+      </w:r>
+      <w:r>
+        <w:t>Two live sites running AI as a core runtime feature: hire-duane.org (interactive resume with RAG-backed chat, job-fit evaluation, and agentic crawling support) and job-radar.net (multi-provider job search with AI scoring, resume tailoring, application workflow, interview prep, and an agentic email agent; hosted on AWS)</w:t>
       </w:r>
     </w:p>
     <w:p>
@@ -401,10 +394,10 @@
           <w:b/>
           <w:bCs/>
         </w:rPr>
-        <w:t xml:space="preserve">Agentic email pipeline </w:t>
-      </w:r>
-      <w:r>
-        <w:t>(in design/early build): LangGraph-orchestrated agent that classifies job emails, extracts structured data through a Classifier+Critic validation loop, and escalates ambiguous cases to a human via interactive Slack, with Langfuse observability and MCP servers on both ends</w:t>
+        <w:t xml:space="preserve">Persistent AI memory infrastructure: </w:t>
+      </w:r>
+      <w:r>
+        <w:t>Deployed OpenBrain and MCP servers: model-agnostic memory layer using PostgreSQL + pgvector (via Supabase), enabling semantic retrieval across Claude, ChatGPT, Cursor, and any MCP-compatible client from a single shared knowledge base</w:t>
       </w:r>
     </w:p>
     <w:p>
@@ -417,27 +410,14 @@
         <w:spacing w:before="40" w:after="40"/>
       </w:pPr>
       <w:r>
-        <w:t>Includes a formal security threat model covering prompt injection, stored XSS, and credential handling; mitigations baked into each build phase, not bolted on after</w:t>
-      </w:r>
-    </w:p>
-    <w:p>
-      <w:pPr>
-        <w:pStyle w:val="ListParagraph"/>
-        <w:numPr>
-          <w:ilvl w:val="0"/>
-          <w:numId w:val="2"/>
-        </w:numPr>
-        <w:spacing w:before="40" w:after="40"/>
-      </w:pPr>
-      <w:r>
-        <w:rPr>
-          <w:b/>
-          <w:bCs/>
-        </w:rPr>
-        <w:t xml:space="preserve">LLM-driven troubleshooting: </w:t>
-      </w:r>
-      <w:r>
-        <w:t>Using LLMs as a first-responder diagnostic layer for system and configuration issues in Home Assistant, bypassing traditional search-based debugging</w:t>
+        <w:rPr>
+          <w:b/>
+          <w:bCs/>
+        </w:rPr>
+        <w:t xml:space="preserve">Workflow automation: </w:t>
+      </w:r>
+      <w:r>
+        <w:t>Building orchestration pipelines in n8n, connecting APIs and services with LLM-powered decision nodes for complex multi-step automation</w:t>
       </w:r>
     </w:p>
     <w:p>

</xml_diff>

<commit_message>
Update current projects with more active language
</commit_message>
<xml_diff>
--- a/frontend/public/Duane_Pinkerton.docx
+++ b/frontend/public/Duane_Pinkerton.docx
@@ -341,10 +341,10 @@
           <w:b/>
           <w:bCs/>
         </w:rPr>
-        <w:t xml:space="preserve">Agentic email pipeline: </w:t>
-      </w:r>
-      <w:r>
-        <w:t>LangGraph-orchestrated agent that classifies job emails, extracts structured data through a Classifier+Critic validation loop, and escalates ambiguous cases to a human via interactive Slack, with Langfuse observability and MCP servers on both ends</w:t>
+        <w:t xml:space="preserve">Built and deployed an agentic email pipeline: </w:t>
+      </w:r>
+      <w:r>
+        <w:t>a LangGraph-orchestrated agent that classifies job emails, extracts structured data through a Classifier+Critic validation loop, and escalates ambiguous cases to a human via interactive Slack, with Langfuse observability and MCP servers on both ends</w:t>
       </w:r>
     </w:p>
     <w:p>
@@ -357,7 +357,14 @@
         <w:spacing w:before="40" w:after="40"/>
       </w:pPr>
       <w:r>
-        <w:t>Includes a formal security threat model covering prompt injection, stored XSS, and credential handling; mitigations baked into each build phase, not bolted on after</w:t>
+        <w:rPr>
+          <w:b/>
+          <w:bCs/>
+        </w:rPr>
+        <w:t xml:space="preserve">Hardened the system against attack vectors, </w:t>
+      </w:r>
+      <w:r>
+        <w:t>including prompt injection, stored XSS, and cross-tenant access, with security mitigations baked into every build phase rather than bolted on after</w:t>
       </w:r>
     </w:p>
     <w:p>
@@ -374,10 +381,10 @@
           <w:b/>
           <w:bCs/>
         </w:rPr>
-        <w:t xml:space="preserve">Production AI applications: </w:t>
-      </w:r>
-      <w:r>
-        <w:t>Two live sites running AI as a core runtime feature: hire-duane.org (interactive resume with RAG-backed chat, job-fit evaluation, and agentic crawling support) and job-radar.net (multi-provider job search with AI scoring, resume tailoring, application workflow, interview prep, and an agentic email agent; hosted on AWS)</w:t>
+        <w:t xml:space="preserve">Built and launched two production AI sites: </w:t>
+      </w:r>
+      <w:r>
+        <w:t>hire-duane.org (interactive resume with RAG-backed chat, job-fit evaluation, and agentic crawling support) and job-radar.net (multi-provider job search with AI scoring, resume tailoring, application workflow, interview prep, and an agentic email agent; hosted on AWS)</w:t>
       </w:r>
     </w:p>
     <w:p>
@@ -394,10 +401,10 @@
           <w:b/>
           <w:bCs/>
         </w:rPr>
-        <w:t xml:space="preserve">Persistent AI memory infrastructure: </w:t>
-      </w:r>
-      <w:r>
-        <w:t>Deployed OpenBrain and MCP servers: model-agnostic memory layer using PostgreSQL + pgvector (via Supabase), enabling semantic retrieval across Claude, ChatGPT, Cursor, and any MCP-compatible client from a single shared knowledge base</w:t>
+        <w:t xml:space="preserve">Deployed OpenBrain with custom MCP servers: </w:t>
+      </w:r>
+      <w:r>
+        <w:t>a model-agnostic memory layer on PostgreSQL + pgvector (Supabase) that serves semantic retrieval to Claude, ChatGPT, Cursor, and any MCP-compatible client from one shared knowledge base</w:t>
       </w:r>
     </w:p>
     <w:p>
@@ -414,10 +421,10 @@
           <w:b/>
           <w:bCs/>
         </w:rPr>
-        <w:t xml:space="preserve">Workflow automation: </w:t>
-      </w:r>
-      <w:r>
-        <w:t>Building orchestration pipelines in n8n, connecting APIs and services with LLM-powered decision nodes for complex multi-step automation</w:t>
+        <w:t xml:space="preserve">Automated multi-step workflows in n8n: </w:t>
+      </w:r>
+      <w:r>
+        <w:t>wiring APIs and services together through LLM-powered decision nodes</w:t>
       </w:r>
     </w:p>
     <w:p>
@@ -434,10 +441,10 @@
           <w:b/>
           <w:bCs/>
         </w:rPr>
-        <w:t xml:space="preserve">AI agents for home automation: </w:t>
-      </w:r>
-      <w:r>
-        <w:t>Prompt-engineered agents providing natural-language control of Home Assistant automations, device states, and scenes through conversational AI</w:t>
+        <w:t xml:space="preserve">Engineered conversational AI agents for Home Assistant: </w:t>
+      </w:r>
+      <w:r>
+        <w:t>natural-language control of automations, device states, and scenes</w:t>
       </w:r>
     </w:p>
     <w:p>
@@ -482,7 +489,6 @@
           <w:sz w:val="22"/>
           <w:szCs w:val="22"/>
         </w:rPr>
-        <w:lastRenderedPageBreak/>
         <w:t>Experience</w:t>
       </w:r>
     </w:p>
@@ -500,6 +506,7 @@
           <w:sz w:val="22"/>
           <w:szCs w:val="22"/>
         </w:rPr>
+        <w:lastRenderedPageBreak/>
         <w:t>Responsys / Oracle</w:t>
       </w:r>
       <w:r>

</xml_diff>

<commit_message>
Add private voice assistant (hermes-satellite) project and edge-AI skill
Co-Authored-By: Claude Opus 4.8 <noreply@anthropic.com>
</commit_message>
<xml_diff>
--- a/frontend/public/Duane_Pinkerton.docx
+++ b/frontend/public/Duane_Pinkerton.docx
@@ -300,6 +300,24 @@
           <w:color w:val="444444"/>
         </w:rPr>
         <w:t>Langfuse (observability, traces, prompt versioning), n8n (workflow automation), deployment, security threat modeling</w:t>
+      </w:r>
+    </w:p>
+    <w:p>
+      <w:pPr>
+        <w:spacing w:before="40" w:after="40"/>
+      </w:pPr>
+      <w:r>
+        <w:rPr>
+          <w:b/>
+          <w:bCs/>
+        </w:rPr>
+        <w:t xml:space="preserve">Edge &amp; on-device AI:  </w:t>
+      </w:r>
+      <w:r>
+        <w:rPr>
+          <w:color w:val="444444"/>
+        </w:rPr>
+        <w:t>wake-word detection, speech-to-text, and text-to-speech on Raspberry Pi (openWakeWord, Moonshine, Piper)</w:t>
       </w:r>
     </w:p>
     <w:p>
@@ -365,6 +383,26 @@
       </w:r>
       <w:r>
         <w:t>including prompt injection, stored XSS, and cross-tenant access, with security mitigations baked into every build phase rather than bolted on after</w:t>
+      </w:r>
+    </w:p>
+    <w:p>
+      <w:pPr>
+        <w:pStyle w:val="ListParagraph"/>
+        <w:numPr>
+          <w:ilvl w:val="0"/>
+          <w:numId w:val="2"/>
+        </w:numPr>
+        <w:spacing w:before="40" w:after="40"/>
+      </w:pPr>
+      <w:r>
+        <w:rPr>
+          <w:b/>
+          <w:bCs/>
+        </w:rPr>
+        <w:t xml:space="preserve">Built and deployed private voice assistant devices </w:t>
+      </w:r>
+      <w:r>
+        <w:t>(Raspberry Pi + ReSpeaker) running a fully on-device wake-word, speech-to-text, and text-to-speech pipeline as a hands-free front-end to a self-hosted AI agent, with per-device memory scoping and a zero-inbound-port security posture</w:t>
       </w:r>
     </w:p>
     <w:p>

</xml_diff>

<commit_message>
Humanizer pass on resume prose; fix stale "26 years" in site meta
Rewrite summary, project bullets, and experience bullets to remove AI
writing patterns: passive constructions, a duplicated opening verb across
bullets, uniform sentence cadence, and the "baked in not bolted on" cliche.
Fix a dangling-subject defect in the Oracle framework bullet.

index.html meta description, og:description, and JSON-LD bio still said
"26 years" and carried an em dash; these drive search and social previews.

Co-Authored-By: Claude Opus 4.8 <noreply@anthropic.com>
</commit_message>
<xml_diff>
--- a/frontend/public/Duane_Pinkerton.docx
+++ b/frontend/public/Duane_Pinkerton.docx
@@ -135,7 +135,7 @@
         <w:spacing w:after="60"/>
       </w:pPr>
       <w:r>
-        <w:t>20+ years in technical professional services, consistently at the intersection of deep implementation work and direct customer engagement. My career has been built around a specific loop: sit with a customer, understand what they actually need, figure out where the product falls short, and go write the missing piece. I’ve built data pipelines and integration systems from scratch, owned them end-to-end through production at enterprise scale, and made the architectural decisions about how they grow. I’m drawn to understanding how systems work, and to making them work better.</w:t>
+        <w:t>20+ years in technical professional services, at the point where deep implementation work meets direct customer engagement. The loop has always been the same: sit with a customer, understand what they actually need, find where the product falls short, then go write the missing piece. I’ve built data pipelines and integration systems from scratch, owned them through production at enterprise scale, and made the architectural decisions about how they grow. I’m drawn to understanding how systems work, and to making them work better.</w:t>
       </w:r>
     </w:p>
     <w:p>
@@ -335,14 +335,6 @@
           <w:szCs w:val="22"/>
         </w:rPr>
         <w:t>Current Projects (2024–present)</w:t>
-      </w:r>
-    </w:p>
-    <w:p>
-      <w:pPr>
-        <w:spacing w:after="80"/>
-      </w:pPr>
-      <w:r>
-        <w:t>Actively building and deploying production AI systems:</w:t>
       </w:r>
     </w:p>
     <w:p>
@@ -362,7 +354,7 @@
         <w:t xml:space="preserve">Built and deployed an agentic email pipeline: </w:t>
       </w:r>
       <w:r>
-        <w:t>a LangGraph-orchestrated agent that classifies job emails, extracts structured data through a Classifier+Critic validation loop, and escalates ambiguous cases to a human via interactive Slack, with Langfuse observability and MCP servers on both ends</w:t>
+        <w:t>a LangGraph agent that classifies job emails, pulls structured data out of them through a Classifier+Critic validation loop, and hands genuinely ambiguous cases to a human over Slack. Langfuse for observability, MCP servers on both ends. Wrote the threat model before any code, then built against it: prompt injection, stored XSS, and cross-tenant access each have a specific mitigation</w:t>
       </w:r>
     </w:p>
     <w:p>
@@ -379,10 +371,10 @@
           <w:b/>
           <w:bCs/>
         </w:rPr>
-        <w:t xml:space="preserve">Hardened the system against attack vectors, </w:t>
-      </w:r>
-      <w:r>
-        <w:t>including prompt injection, stored XSS, and cross-tenant access, with security mitigations baked into every build phase rather than bolted on after</w:t>
+        <w:t xml:space="preserve">Designed and built private voice assistant devices</w:t>
+      </w:r>
+      <w:r>
+        <w:t xml:space="preserve"> on Raspberry Pi and ReSpeaker hardware: wake word, speech-to-text, and speech synthesis all run on the device itself, feeding a self-hosted AI agent hands-free. Each unit keeps its own memory scope and listens on no inbound ports</w:t>
       </w:r>
     </w:p>
     <w:p>
@@ -399,10 +391,10 @@
           <w:b/>
           <w:bCs/>
         </w:rPr>
-        <w:t xml:space="preserve">Built and deployed private voice assistant devices </w:t>
-      </w:r>
-      <w:r>
-        <w:t>(Raspberry Pi + ReSpeaker) running a fully on-device wake-word, speech-to-text, and text-to-speech pipeline as a hands-free front-end to a self-hosted AI agent, with per-device memory scoping and a zero-inbound-port security posture</w:t>
+        <w:t xml:space="preserve">Launched two production AI sites.</w:t>
+      </w:r>
+      <w:r>
+        <w:t xml:space="preserve"> hire-duane.org is an interactive resume with RAG-backed chat and job-fit evaluation, built to be readable by crawling agents. job-radar.net runs on AWS and handles multi-provider job search with AI scoring, resume tailoring, application workflow, and interview prep</w:t>
       </w:r>
     </w:p>
     <w:p>
@@ -419,10 +411,10 @@
           <w:b/>
           <w:bCs/>
         </w:rPr>
-        <w:t xml:space="preserve">Built and launched two production AI sites: </w:t>
-      </w:r>
-      <w:r>
-        <w:t>hire-duane.org (interactive resume with RAG-backed chat, job-fit evaluation, and agentic crawling support) and job-radar.net (multi-provider job search with AI scoring, resume tailoring, application workflow, interview prep, and an agentic email agent; hosted on AWS)</w:t>
+        <w:t xml:space="preserve">Deployed OpenBrain behind custom MCP servers:</w:t>
+      </w:r>
+      <w:r>
+        <w:t xml:space="preserve"> a model-agnostic memory layer on PostgreSQL and pgvector that answers semantic queries from Claude, ChatGPT, Cursor, or any MCP client, all against one shared knowledge base</w:t>
       </w:r>
     </w:p>
     <w:p>
@@ -439,10 +431,10 @@
           <w:b/>
           <w:bCs/>
         </w:rPr>
-        <w:t xml:space="preserve">Deployed OpenBrain with custom MCP servers: </w:t>
-      </w:r>
-      <w:r>
-        <w:t>a model-agnostic memory layer on PostgreSQL + pgvector (Supabase) that serves semantic retrieval to Claude, ChatGPT, Cursor, and any MCP-compatible client from one shared knowledge base</w:t>
+        <w:t xml:space="preserve">Automated multi-step workflows in n8n,</w:t>
+      </w:r>
+      <w:r>
+        <w:t xml:space="preserve"> wiring APIs and services together with LLM-powered decision nodes</w:t>
       </w:r>
     </w:p>
     <w:p>
@@ -459,10 +451,106 @@
           <w:b/>
           <w:bCs/>
         </w:rPr>
-        <w:t xml:space="preserve">Automated multi-step workflows in n8n: </w:t>
-      </w:r>
-      <w:r>
-        <w:t>wiring APIs and services together through LLM-powered decision nodes</w:t>
+        <w:t xml:space="preserve">Wrote conversational agents for Home Assistant</w:t>
+      </w:r>
+      <w:r>
+        <w:t xml:space="preserve"> that handle automations, device states, and scenes in plain language</w:t>
+      </w:r>
+    </w:p>
+    <w:p>
+      <w:pPr>
+        <w:pBdr>
+          <w:bottom w:val="single" w:sz="6" w:space="4" w:color="2B5BA8"/>
+        </w:pBdr>
+        <w:spacing w:before="260" w:after="120"/>
+        <w:rPr>
+          <w:b/>
+          <w:bCs/>
+          <w:sz w:val="22"/>
+          <w:szCs w:val="22"/>
+        </w:rPr>
+      </w:pPr>
+    </w:p>
+    <w:p>
+      <w:pPr>
+        <w:pBdr>
+          <w:bottom w:val="single" w:sz="6" w:space="4" w:color="2B5BA8"/>
+        </w:pBdr>
+        <w:spacing w:before="260" w:after="120"/>
+        <w:rPr>
+          <w:b/>
+          <w:bCs/>
+          <w:sz w:val="22"/>
+          <w:szCs w:val="22"/>
+        </w:rPr>
+      </w:pPr>
+    </w:p>
+    <w:p>
+      <w:pPr>
+        <w:pBdr>
+          <w:bottom w:val="single" w:sz="6" w:space="4" w:color="2B5BA8"/>
+        </w:pBdr>
+        <w:spacing w:before="260" w:after="120"/>
+      </w:pPr>
+      <w:r>
+        <w:rPr>
+          <w:b/>
+          <w:bCs/>
+          <w:sz w:val="22"/>
+          <w:szCs w:val="22"/>
+        </w:rPr>
+        <w:t>Experience</w:t>
+      </w:r>
+    </w:p>
+    <w:p>
+      <w:pPr>
+        <w:tabs>
+          <w:tab w:val="right" w:pos="10080"/>
+        </w:tabs>
+        <w:spacing w:before="220" w:after="40"/>
+      </w:pPr>
+      <w:r>
+        <w:rPr>
+          <w:b/>
+          <w:bCs/>
+          <w:sz w:val="22"/>
+          <w:szCs w:val="22"/>
+        </w:rPr>
+        <w:lastRenderedPageBreak/>
+        <w:t>Responsys / Oracle</w:t>
+      </w:r>
+      <w:r>
+        <w:rPr>
+          <w:color w:val="666666"/>
+        </w:rPr>
+        <w:tab/>
+        <w:t>2007 – 2026</w:t>
+      </w:r>
+    </w:p>
+    <w:p>
+      <w:pPr>
+        <w:spacing w:after="80"/>
+      </w:pPr>
+      <w:r>
+        <w:rPr>
+          <w:i/>
+          <w:iCs/>
+          <w:color w:val="555555"/>
+        </w:rPr>
+        <w:t>Principal Professional Solutions Consultant → Data Architect → Solutions Architect → Principal Applications Engineer, Operations</w:t>
+      </w:r>
+    </w:p>
+    <w:p>
+      <w:pPr>
+        <w:spacing w:before="120" w:after="60"/>
+      </w:pPr>
+      <w:r>
+        <w:rPr>
+          <w:b/>
+          <w:bCs/>
+          <w:color w:val="444444"/>
+        </w:rPr>
+        <w:t>Building the Platform  (2007 – 2013)</w:t>
       </w:r>
     </w:p>
     <w:p>
@@ -475,110 +563,7 @@
         <w:spacing w:before="40" w:after="40"/>
       </w:pPr>
       <w:r>
-        <w:rPr>
-          <w:b/>
-          <w:bCs/>
-        </w:rPr>
-        <w:t xml:space="preserve">Engineered conversational AI agents for Home Assistant: </w:t>
-      </w:r>
-      <w:r>
-        <w:t>natural-language control of automations, device states, and scenes</w:t>
-      </w:r>
-    </w:p>
-    <w:p>
-      <w:pPr>
-        <w:pBdr>
-          <w:bottom w:val="single" w:sz="6" w:space="4" w:color="2B5BA8"/>
-        </w:pBdr>
-        <w:spacing w:before="260" w:after="120"/>
-        <w:rPr>
-          <w:b/>
-          <w:bCs/>
-          <w:sz w:val="22"/>
-          <w:szCs w:val="22"/>
-        </w:rPr>
-      </w:pPr>
-    </w:p>
-    <w:p>
-      <w:pPr>
-        <w:pBdr>
-          <w:bottom w:val="single" w:sz="6" w:space="4" w:color="2B5BA8"/>
-        </w:pBdr>
-        <w:spacing w:before="260" w:after="120"/>
-        <w:rPr>
-          <w:b/>
-          <w:bCs/>
-          <w:sz w:val="22"/>
-          <w:szCs w:val="22"/>
-        </w:rPr>
-      </w:pPr>
-    </w:p>
-    <w:p>
-      <w:pPr>
-        <w:pBdr>
-          <w:bottom w:val="single" w:sz="6" w:space="4" w:color="2B5BA8"/>
-        </w:pBdr>
-        <w:spacing w:before="260" w:after="120"/>
-      </w:pPr>
-      <w:r>
-        <w:rPr>
-          <w:b/>
-          <w:bCs/>
-          <w:sz w:val="22"/>
-          <w:szCs w:val="22"/>
-        </w:rPr>
-        <w:t>Experience</w:t>
-      </w:r>
-    </w:p>
-    <w:p>
-      <w:pPr>
-        <w:tabs>
-          <w:tab w:val="right" w:pos="10080"/>
-        </w:tabs>
-        <w:spacing w:before="220" w:after="40"/>
-      </w:pPr>
-      <w:r>
-        <w:rPr>
-          <w:b/>
-          <w:bCs/>
-          <w:sz w:val="22"/>
-          <w:szCs w:val="22"/>
-        </w:rPr>
-        <w:lastRenderedPageBreak/>
-        <w:t>Responsys / Oracle</w:t>
-      </w:r>
-      <w:r>
-        <w:rPr>
-          <w:color w:val="666666"/>
-        </w:rPr>
-        <w:tab/>
-        <w:t>2007 – 2026</w:t>
-      </w:r>
-    </w:p>
-    <w:p>
-      <w:pPr>
-        <w:spacing w:after="80"/>
-      </w:pPr>
-      <w:r>
-        <w:rPr>
-          <w:i/>
-          <w:iCs/>
-          <w:color w:val="555555"/>
-        </w:rPr>
-        <w:t>Principal Professional Solutions Consultant → Data Architect → Solutions Architect → Principal Applications Engineer, Operations</w:t>
-      </w:r>
-    </w:p>
-    <w:p>
-      <w:pPr>
-        <w:spacing w:before="120" w:after="60"/>
-      </w:pPr>
-      <w:r>
-        <w:rPr>
-          <w:b/>
-          <w:bCs/>
-          <w:color w:val="444444"/>
-        </w:rPr>
-        <w:t>Building the Platform  (2007 – 2013)</w:t>
+        <w:t>Designed and built the company’s data pipeline and integration framework from scratch. It replaced 95% of the custom scripts running in production, became the standard across professional services, and grew to carry 200+ production jobs for 80+ enterprise customers</w:t>
       </w:r>
     </w:p>
     <w:p>
@@ -591,7 +576,7 @@
         <w:spacing w:before="40" w:after="40"/>
       </w:pPr>
       <w:r>
-        <w:t>Designed and built the company’s custom data pipeline and integration framework from scratch: replaced 95% of existing custom scripts in production, became the organization standard, and scaled to 200+ production jobs across 80+ enterprise customers</w:t>
+        <w:t>Owned end-to-end delivery of customer engagements: discovery, requirements gathering, documentation, implementation, custom development, and handover to support</w:t>
       </w:r>
     </w:p>
     <w:p>
@@ -604,7 +589,20 @@
         <w:spacing w:before="40" w:after="40"/>
       </w:pPr>
       <w:r>
-        <w:t>Owned end-to-end delivery of customer engagements: discovery, requirements gathering, documentation, implementation, custom development, and handover to support</w:t>
+        <w:t>Trained consultants and partners on implementation best practices; primary subject matter expert for custom data integration across the organization</w:t>
+      </w:r>
+    </w:p>
+    <w:p>
+      <w:pPr>
+        <w:spacing w:before="120" w:after="60"/>
+      </w:pPr>
+      <w:r>
+        <w:rPr>
+          <w:b/>
+          <w:bCs/>
+          <w:color w:val="444444"/>
+        </w:rPr>
+        <w:t>Owning the Platform  (2013 – 2026)</w:t>
       </w:r>
     </w:p>
     <w:p>
@@ -617,20 +615,7 @@
         <w:spacing w:before="40" w:after="40"/>
       </w:pPr>
       <w:r>
-        <w:t>Trained consultants and partners on implementation best practices; primary subject matter expert for custom data integration across the organization</w:t>
-      </w:r>
-    </w:p>
-    <w:p>
-      <w:pPr>
-        <w:spacing w:before="120" w:after="60"/>
-      </w:pPr>
-      <w:r>
-        <w:rPr>
-          <w:b/>
-          <w:bCs/>
-          <w:color w:val="444444"/>
-        </w:rPr>
-        <w:t>Owning the Platform  (2013 – 2026)</w:t>
+        <w:t>Made the architectural decisions on reliability, redundancy, and capacity planning after Oracle acquired the company</w:t>
       </w:r>
     </w:p>
     <w:p>
@@ -643,7 +628,7 @@
         <w:spacing w:before="40" w:after="40"/>
       </w:pPr>
       <w:r>
-        <w:t>Made key architectural decisions around platform reliability, redundancy, and capacity planning following Oracle’s acquisition</w:t>
+        <w:t>Led the migration of the whole environment from bare metal to containers on Oracle Cloud Infrastructure (OCI), using Docker, Kubernetes, Git, and Jenkins, and finished it without a significant downtime event</w:t>
       </w:r>
     </w:p>
     <w:p>
@@ -656,7 +641,67 @@
         <w:spacing w:before="40" w:after="40"/>
       </w:pPr>
       <w:r>
-        <w:t>Led the migration of the full environment from bare metal to a containerized infrastructure on Oracle Cloud Infrastructure (OCI) using Docker, Kubernetes, Git, and Jenkins; completed with zero significant downtime events</w:t>
+        <w:t>Deployed the environment in new datacenters as the platform expanded</w:t>
+      </w:r>
+    </w:p>
+    <w:p>
+      <w:pPr>
+        <w:spacing w:before="80" w:after="40"/>
+      </w:pPr>
+      <w:r>
+        <w:rPr>
+          <w:b/>
+          <w:bCs/>
+          <w:color w:val="666666"/>
+          <w:sz w:val="17"/>
+          <w:szCs w:val="17"/>
+        </w:rPr>
+        <w:t xml:space="preserve">Notable customers: </w:t>
+      </w:r>
+      <w:r>
+        <w:rPr>
+          <w:color w:val="666666"/>
+          <w:sz w:val="17"/>
+          <w:szCs w:val="17"/>
+        </w:rPr>
+        <w:t>Williams Sonoma, Pottery Barn, West Elm, Epson, Orbitz, Carlson Wagonlit, Verizon, Disney, Symantec, Lenovo, Levi’s, Lego, PayPal, See’s, Coach, Grainger, Intuit, Wells Fargo, BabyCenter</w:t>
+      </w:r>
+    </w:p>
+    <w:p>
+      <w:pPr>
+        <w:tabs>
+          <w:tab w:val="right" w:pos="10080"/>
+        </w:tabs>
+        <w:spacing w:before="220" w:after="40"/>
+      </w:pPr>
+      <w:r>
+        <w:rPr>
+          <w:b/>
+          <w:bCs/>
+          <w:sz w:val="22"/>
+          <w:szCs w:val="22"/>
+        </w:rPr>
+        <w:t>Extensity / Geac / Infor</w:t>
+      </w:r>
+      <w:r>
+        <w:rPr>
+          <w:color w:val="666666"/>
+        </w:rPr>
+        <w:tab/>
+        <w:t>1999 – 2007</w:t>
+      </w:r>
+    </w:p>
+    <w:p>
+      <w:pPr>
+        <w:spacing w:after="80"/>
+      </w:pPr>
+      <w:r>
+        <w:rPr>
+          <w:i/>
+          <w:iCs/>
+          <w:color w:val="555555"/>
+        </w:rPr>
+        <w:t>Principal Professional Services Consultant → Team Lead, Custom Solutions Group</w:t>
       </w:r>
     </w:p>
     <w:p>
@@ -669,67 +714,7 @@
         <w:spacing w:before="40" w:after="40"/>
       </w:pPr>
       <w:r>
-        <w:t>Deployed and stood up the environment in new datacenters as the platform expanded geographically</w:t>
-      </w:r>
-    </w:p>
-    <w:p>
-      <w:pPr>
-        <w:spacing w:before="80" w:after="40"/>
-      </w:pPr>
-      <w:r>
-        <w:rPr>
-          <w:b/>
-          <w:bCs/>
-          <w:color w:val="666666"/>
-          <w:sz w:val="17"/>
-          <w:szCs w:val="17"/>
-        </w:rPr>
-        <w:t xml:space="preserve">Notable customers: </w:t>
-      </w:r>
-      <w:r>
-        <w:rPr>
-          <w:color w:val="666666"/>
-          <w:sz w:val="17"/>
-          <w:szCs w:val="17"/>
-        </w:rPr>
-        <w:t>Williams Sonoma, Pottery Barn, West Elm, Epson, Orbitz, Carlson Wagonlit, Verizon, Disney, Symantec, Lenovo, Levi’s, Lego, PayPal, See’s, Coach, Grainger, Intuit, Wells Fargo, BabyCenter</w:t>
-      </w:r>
-    </w:p>
-    <w:p>
-      <w:pPr>
-        <w:tabs>
-          <w:tab w:val="right" w:pos="10080"/>
-        </w:tabs>
-        <w:spacing w:before="220" w:after="40"/>
-      </w:pPr>
-      <w:r>
-        <w:rPr>
-          <w:b/>
-          <w:bCs/>
-          <w:sz w:val="22"/>
-          <w:szCs w:val="22"/>
-        </w:rPr>
-        <w:t>Extensity / Geac / Infor</w:t>
-      </w:r>
-      <w:r>
-        <w:rPr>
-          <w:color w:val="666666"/>
-        </w:rPr>
-        <w:tab/>
-        <w:t>1999 – 2007</w:t>
-      </w:r>
-    </w:p>
-    <w:p>
-      <w:pPr>
-        <w:spacing w:after="80"/>
-      </w:pPr>
-      <w:r>
-        <w:rPr>
-          <w:i/>
-          <w:iCs/>
-          <w:color w:val="555555"/>
-        </w:rPr>
-        <w:t>Principal Professional Services Consultant → Team Lead, Custom Solutions Group</w:t>
+        <w:t>Ran enterprise software implementations start to finish, from discovery and requirements through training and support handover, for domestic and international clients</w:t>
       </w:r>
     </w:p>
     <w:p>
@@ -742,20 +727,7 @@
         <w:spacing w:before="40" w:after="40"/>
       </w:pPr>
       <w:r>
-        <w:t>Owned end-to-end delivery of enterprise software implementations (discovery, requirements, implementation, training, and support handover) across a portfolio of complex domestic and international clients</w:t>
-      </w:r>
-    </w:p>
-    <w:p>
-      <w:pPr>
-        <w:pStyle w:val="ListParagraph"/>
-        <w:numPr>
-          <w:ilvl w:val="0"/>
-          <w:numId w:val="2"/>
-        </w:numPr>
-        <w:spacing w:before="40" w:after="40"/>
-      </w:pPr>
-      <w:r>
-        <w:t>Built multi-currency and exchange rate support from scratch, enabling the company’s first international enterprise deployments (Cisco, Sybase); those capabilities were later incorporated into the core product</w:t>
+        <w:t>Built multi-currency and exchange rate support from scratch, which made the company’s first international enterprise deployments possible at Cisco and Sybase. The features later shipped in the core product</w:t>
       </w:r>
     </w:p>
     <w:p>

</xml_diff>

<commit_message>
Prerender site for crawlers, add Oracle escalation bullet, automate PDF
The homepage served an empty <div id="root">, so anything that does not run
JavaScript (AI agents, link previews, crawlers) saw only meta tags. Cloudflare
was ruled out: the DNS record is not proxied and ClaudeBot gets a clean 200.

Prerender the app to static HTML at build time via a new SSR entry and
prerender.mjs, wired into `npm run build` so it cannot be skipped. The step
asserts the output contains real resume text and fails the build otherwise.
The JSON-LD Person block is now generated from resume.js rather than
hand-maintained, removing the copy that had drifted to "26 years".
Deployed index.html goes from 3.8kB to 46kB of real content.

Also link llms.txt and resume.txt from the head, robots.txt, and sitemap.

Add scripts/build-pdf.sh using docx2pdf, which drives Word and reproduces the
manual export exactly, removing the hand step from the workflow.

Co-Authored-By: Claude Opus 5 <noreply@anthropic.com>
</commit_message>
<xml_diff>
--- a/frontend/public/Duane_Pinkerton.docx
+++ b/frontend/public/Duane_Pinkerton.docx
@@ -603,6 +603,19 @@
           <w:color w:val="444444"/>
         </w:rPr>
         <w:t>Owning the Platform  (2013 – 2026)</w:t>
+      </w:r>
+    </w:p>
+    <w:p>
+      <w:pPr>
+        <w:pStyle w:val="ListParagraph"/>
+        <w:numPr>
+          <w:ilvl w:val="0"/>
+          <w:numId w:val="2"/>
+        </w:numPr>
+        <w:spacing w:before="40" w:after="40"/>
+      </w:pPr>
+      <w:r>
+        <w:t>Fielded the final escalations on production data integration issues, joining customer calls as the subject matter expert. As the author of the framework, the buck stopped there: anything that could not be resolved was an infrastructure problem, not an integration one.</w:t>
       </w:r>
     </w:p>
     <w:p>

</xml_diff>